<commit_message>
Add GitHub Actions evidence to screenshots, verification and report
</commit_message>
<xml_diff>
--- a/reports/assignment_report.docx
+++ b/reports/assignment_report.docx
@@ -545,7 +545,7 @@
     </w:p>
     <w:p>
       <w:r>
-        <w:t>GitHub Actions (.github/workflows/ci.yml) runs four dependent jobs: lint (ruff) -&gt; train + test (JUnit XML, step summary, report) -&gt; Docker build + HTTP smoke test -&gt; kind deploy + ingress verification. Any failure stops later jobs; logs and artifacts (model, MLflow store, test XML, container and k8s evidence) are uploaded.</w:t>
+        <w:t>GitHub Actions (.github/workflows/ci.yml) runs four dependent jobs: lint (ruff) -&gt; train + test (JUnit XML, step summary, report) -&gt; Docker build + HTTP smoke test -&gt; kind deploy + ingress verification. Any failure stops later jobs; logs and artifacts (model, MLflow store, test XML, container and k8s evidence) are uploaded. Run #1 on GitHub passed all four jobs in 7m 8s.</w:t>
       </w:r>
     </w:p>
     <w:p>
@@ -586,6 +586,42 @@
     </w:p>
     <w:p>
       <w:r>
+        <w:drawing>
+          <wp:inline xmlns:a="http://schemas.openxmlformats.org/drawingml/2006/main" xmlns:pic="http://schemas.openxmlformats.org/drawingml/2006/picture">
+            <wp:extent cx="5486400" cy="1645920"/>
+            <wp:docPr id="12" name="Picture 12"/>
+            <wp:cNvGraphicFramePr>
+              <a:graphicFrameLocks noChangeAspect="1"/>
+            </wp:cNvGraphicFramePr>
+            <a:graphic>
+              <a:graphicData uri="http://schemas.openxmlformats.org/drawingml/2006/picture">
+                <pic:pic>
+                  <pic:nvPicPr>
+                    <pic:cNvPr id="0" name="10b_github_actions_summary.png"/>
+                    <pic:cNvPicPr/>
+                  </pic:nvPicPr>
+                  <pic:blipFill>
+                    <a:blip r:embed="rId20"/>
+                    <a:stretch>
+                      <a:fillRect/>
+                    </a:stretch>
+                  </pic:blipFill>
+                  <pic:spPr>
+                    <a:xfrm>
+                      <a:off x="0" y="0"/>
+                      <a:ext cx="5486400" cy="1645920"/>
+                    </a:xfrm>
+                    <a:prstGeom prst="rect"/>
+                  </pic:spPr>
+                </pic:pic>
+              </a:graphicData>
+            </a:graphic>
+          </wp:inline>
+        </w:drawing>
+      </w:r>
+    </w:p>
+    <w:p>
+      <w:r>
         <w:br w:type="page"/>
       </w:r>
     </w:p>
@@ -612,7 +648,7 @@
         <w:drawing>
           <wp:inline xmlns:a="http://schemas.openxmlformats.org/drawingml/2006/main" xmlns:pic="http://schemas.openxmlformats.org/drawingml/2006/picture">
             <wp:extent cx="5486400" cy="2618842"/>
-            <wp:docPr id="12" name="Picture 12"/>
+            <wp:docPr id="13" name="Picture 13"/>
             <wp:cNvGraphicFramePr>
               <a:graphicFrameLocks noChangeAspect="1"/>
             </wp:cNvGraphicFramePr>
@@ -624,7 +660,7 @@
                     <pic:cNvPicPr/>
                   </pic:nvPicPr>
                   <pic:blipFill>
-                    <a:blip r:embed="rId20"/>
+                    <a:blip r:embed="rId21"/>
                     <a:stretch>
                       <a:fillRect/>
                     </a:stretch>
@@ -671,7 +707,7 @@
         <w:drawing>
           <wp:inline xmlns:a="http://schemas.openxmlformats.org/drawingml/2006/main" xmlns:pic="http://schemas.openxmlformats.org/drawingml/2006/picture">
             <wp:extent cx="5486400" cy="1686154"/>
-            <wp:docPr id="13" name="Picture 13"/>
+            <wp:docPr id="14" name="Picture 14"/>
             <wp:cNvGraphicFramePr>
               <a:graphicFrameLocks noChangeAspect="1"/>
             </wp:cNvGraphicFramePr>
@@ -683,7 +719,7 @@
                     <pic:cNvPicPr/>
                   </pic:nvPicPr>
                   <pic:blipFill>
-                    <a:blip r:embed="rId21"/>
+                    <a:blip r:embed="rId22"/>
                     <a:stretch>
                       <a:fillRect/>
                     </a:stretch>
@@ -707,7 +743,7 @@
         <w:drawing>
           <wp:inline xmlns:a="http://schemas.openxmlformats.org/drawingml/2006/main" xmlns:pic="http://schemas.openxmlformats.org/drawingml/2006/picture">
             <wp:extent cx="5486400" cy="3550024"/>
-            <wp:docPr id="14" name="Picture 14"/>
+            <wp:docPr id="15" name="Picture 15"/>
             <wp:cNvGraphicFramePr>
               <a:graphicFrameLocks noChangeAspect="1"/>
             </wp:cNvGraphicFramePr>
@@ -719,7 +755,7 @@
                     <pic:cNvPicPr/>
                   </pic:nvPicPr>
                   <pic:blipFill>
-                    <a:blip r:embed="rId22"/>
+                    <a:blip r:embed="rId23"/>
                     <a:stretch>
                       <a:fillRect/>
                     </a:stretch>
@@ -771,7 +807,7 @@
         <w:drawing>
           <wp:inline xmlns:a="http://schemas.openxmlformats.org/drawingml/2006/main" xmlns:pic="http://schemas.openxmlformats.org/drawingml/2006/picture">
             <wp:extent cx="5486400" cy="2560320"/>
-            <wp:docPr id="15" name="Picture 15"/>
+            <wp:docPr id="16" name="Picture 16"/>
             <wp:cNvGraphicFramePr>
               <a:graphicFrameLocks noChangeAspect="1"/>
             </wp:cNvGraphicFramePr>
@@ -783,7 +819,7 @@
                     <pic:cNvPicPr/>
                   </pic:nvPicPr>
                   <pic:blipFill>
-                    <a:blip r:embed="rId23"/>
+                    <a:blip r:embed="rId24"/>
                     <a:stretch>
                       <a:fillRect/>
                     </a:stretch>

</xml_diff>